<commit_message>
fix: private policy checkbox fixed
</commit_message>
<xml_diff>
--- a/assets/cv.docx
+++ b/assets/cv.docx
@@ -50,7 +50,15 @@
           <w:sz w:val="24"/>
           <w:szCs w:val="24"/>
         </w:rPr>
-        <w:t xml:space="preserve">Офис, гибрид, </w:t>
+        <w:t>Г</w:t>
+      </w:r>
+      <w:r>
+        <w:rPr>
+          <w:rFonts w:ascii="Times New Roman" w:hAnsi="Times New Roman" w:cs="Times New Roman"/>
+          <w:sz w:val="24"/>
+          <w:szCs w:val="24"/>
+        </w:rPr>
+        <w:t xml:space="preserve">ибрид, </w:t>
       </w:r>
       <w:r>
         <w:rPr>
@@ -67,6 +75,14 @@
           <w:szCs w:val="24"/>
         </w:rPr>
         <w:t>, релокация</w:t>
+      </w:r>
+      <w:r>
+        <w:rPr>
+          <w:rFonts w:ascii="Times New Roman" w:hAnsi="Times New Roman" w:cs="Times New Roman"/>
+          <w:sz w:val="24"/>
+          <w:szCs w:val="24"/>
+        </w:rPr>
+        <w:t xml:space="preserve"> (ИП, счет страны без санкций)</w:t>
       </w:r>
     </w:p>
     <w:p>
@@ -843,15 +859,16 @@
           <w:rFonts w:ascii="Times New Roman" w:hAnsi="Times New Roman" w:cs="Times New Roman"/>
           <w:sz w:val="24"/>
           <w:szCs w:val="24"/>
-        </w:rPr>
-      </w:pPr>
-      <w:r>
-        <w:rPr>
-          <w:rFonts w:ascii="Times New Roman" w:hAnsi="Times New Roman" w:cs="Times New Roman"/>
-          <w:sz w:val="24"/>
-          <w:szCs w:val="24"/>
           <w:lang w:val="en-US"/>
         </w:rPr>
+      </w:pPr>
+      <w:r>
+        <w:rPr>
+          <w:rFonts w:ascii="Times New Roman" w:hAnsi="Times New Roman" w:cs="Times New Roman"/>
+          <w:sz w:val="24"/>
+          <w:szCs w:val="24"/>
+          <w:lang w:val="en-US"/>
+        </w:rPr>
         <w:t>REACT</w:t>
       </w:r>
       <w:r>
@@ -892,6 +909,7 @@
           <w:rFonts w:ascii="Times New Roman" w:hAnsi="Times New Roman" w:cs="Times New Roman"/>
           <w:sz w:val="24"/>
           <w:szCs w:val="24"/>
+          <w:lang w:val="en-US"/>
         </w:rPr>
         <w:t xml:space="preserve">, 2025 </w:t>
       </w:r>

</xml_diff>